<commit_message>
Regenerate CV Word documents with updated MYCV content - Summary, Experience, Skills, Education, and Achievements
</commit_message>
<xml_diff>
--- a/Rolyn_Kiunisala_CV.docx
+++ b/Rolyn_Kiunisala_CV.docx
@@ -4,35 +4,44 @@
   <w:body>
     <w:p>
       <w:pPr>
-        <w:pStyle w:val="Title"/>
+        <w:jc w:val="center"/>
       </w:pPr>
       <w:r>
+        <w:rPr>
+          <w:b/>
+          <w:sz w:val="48"/>
+        </w:rPr>
         <w:t>ROLYN KIUNISALA</w:t>
       </w:r>
     </w:p>
     <w:p>
+      <w:pPr>
+        <w:jc w:val="center"/>
+      </w:pPr>
       <w:r>
-        <w:t>Cebu, Philippines</w:t>
-      </w:r>
-    </w:p>
-    <w:p>
-      <w:r>
-        <w:t>Email: rolynkiunisala@gmail.com</w:t>
-      </w:r>
-    </w:p>
-    <w:p>
-      <w:r>
-        <w:t>Phone: +63 906 454 4620</w:t>
-      </w:r>
-    </w:p>
-    <w:p>
-      <w:r>
-        <w:t>LinkedIn: https://www.linkedin.com/in/rolyn-kiunisala-b862ab377/</w:t>
+        <w:rPr>
+          <w:sz w:val="22"/>
+        </w:rPr>
+        <w:t>Full Stack Software Developer | Software Engineer</w:t>
       </w:r>
     </w:p>
     <w:p>
       <w:pPr>
-        <w:pStyle w:val="Heading1"/>
+        <w:spacing w:after="240"/>
+        <w:jc w:val="center"/>
+      </w:pPr>
+      <w:r>
+        <w:t>Cebu, Philippines | rolynkiunisala@gmail.com | +63 906 454 4620</w:t>
+        <w:br/>
+      </w:r>
+      <w:r>
+        <w:t>LinkedIn: linkedin.com/in/rolyn-kiunisala-b862ab377</w:t>
+      </w:r>
+    </w:p>
+    <w:p>
+      <w:pPr>
+        <w:pStyle w:val="Heading2"/>
+        <w:spacing w:before="120" w:after="120"/>
       </w:pPr>
       <w:r>
         <w:t>PROFESSIONAL SUMMARY</w:t>
@@ -45,7 +54,8 @@
     </w:p>
     <w:p>
       <w:pPr>
-        <w:pStyle w:val="Heading1"/>
+        <w:pStyle w:val="Heading2"/>
+        <w:spacing w:before="120" w:after="120"/>
       </w:pPr>
       <w:r>
         <w:t>CORE SKILLS</w:t>
@@ -64,7 +74,7 @@
         <w:pStyle w:val="ListBullet"/>
       </w:pPr>
       <w:r>
-        <w:t>Frontend: HTML, CSS/SCSS, Angular, React (basic)</w:t>
+        <w:t>Frontend: HTML, CSS/SCSS, JavaScript, Angular, React (basic)</w:t>
       </w:r>
     </w:p>
     <w:p>
@@ -117,28 +127,27 @@
     </w:p>
     <w:p>
       <w:pPr>
-        <w:pStyle w:val="Heading1"/>
+        <w:pStyle w:val="Heading2"/>
+        <w:spacing w:before="120" w:after="120"/>
       </w:pPr>
       <w:r>
         <w:t>PROFESSIONAL EXPERIENCE</w:t>
       </w:r>
     </w:p>
     <w:p>
-      <w:pPr>
-        <w:pStyle w:val="Heading2"/>
-      </w:pPr>
       <w:r>
+        <w:rPr>
+          <w:b/>
+        </w:rPr>
         <w:t>Full Stack Software Developer</w:t>
       </w:r>
     </w:p>
     <w:p>
+      <w:pPr>
+        <w:spacing w:after="60"/>
+      </w:pPr>
       <w:r>
-        <w:t>ALMA Phil Manpower Services Corp. – Cebu City, Philippines</w:t>
-      </w:r>
-    </w:p>
-    <w:p>
-      <w:r>
-        <w:t>March 18, 2026 – Present (Project-Based Contract)</w:t>
+        <w:t>ALMA Phil Manpower Services Corp. – Cebu City, Philippines | March 18, 2026 – Present</w:t>
       </w:r>
     </w:p>
     <w:p>
@@ -146,7 +155,7 @@
         <w:pStyle w:val="ListBullet"/>
       </w:pPr>
       <w:r>
-        <w:t>Design, develop, and maintain full stack web applications based on client requirements.</w:t>
+        <w:t>Designed, developed, and maintained full stack web applications.</w:t>
       </w:r>
     </w:p>
     <w:p>
@@ -154,7 +163,7 @@
         <w:pStyle w:val="ListBullet"/>
       </w:pPr>
       <w:r>
-        <w:t>Develop and integrate REST APIs and backend services using Node.js, Java, and .NET.</w:t>
+        <w:t>Built REST APIs and backend services with Node.js, Java, and .NET.</w:t>
       </w:r>
     </w:p>
     <w:p>
@@ -162,7 +171,7 @@
         <w:pStyle w:val="ListBullet"/>
       </w:pPr>
       <w:r>
-        <w:t>Build responsive frontend interfaces using Angular and modern web technologies.</w:t>
+        <w:t>Developed responsive frontend interfaces using Angular.</w:t>
       </w:r>
     </w:p>
     <w:p>
@@ -170,7 +179,7 @@
         <w:pStyle w:val="ListBullet"/>
       </w:pPr>
       <w:r>
-        <w:t>Perform debugging, troubleshooting, and performance optimization.</w:t>
+        <w:t>Handled debugging, troubleshooting, and performance tuning.</w:t>
       </w:r>
     </w:p>
     <w:p>
@@ -178,7 +187,23 @@
         <w:pStyle w:val="ListBullet"/>
       </w:pPr>
       <w:r>
-        <w:t>Collaborate with project managers and technical teams in Agile environment.</w:t>
+        <w:t>Collaborated in Agile teams for testing, deployment, and release support.</w:t>
+      </w:r>
+    </w:p>
+    <w:p>
+      <w:r>
+        <w:rPr>
+          <w:b/>
+        </w:rPr>
+        <w:t>Software Engineering / Packaged App Development Associate</w:t>
+      </w:r>
+    </w:p>
+    <w:p>
+      <w:pPr>
+        <w:spacing w:after="60"/>
+      </w:pPr>
+      <w:r>
+        <w:t>Accenture Inc. – Cebu IT Park, Cebu City | February 27, 2023 – March 18, 2026</w:t>
       </w:r>
     </w:p>
     <w:p>
@@ -186,7 +211,7 @@
         <w:pStyle w:val="ListBullet"/>
       </w:pPr>
       <w:r>
-        <w:t>Participate in system enhancements, testing, and deployment activities.</w:t>
+        <w:t>Supported enterprise-level packaged application development.</w:t>
       </w:r>
     </w:p>
     <w:p>
@@ -194,25 +219,7 @@
         <w:pStyle w:val="ListBullet"/>
       </w:pPr>
       <w:r>
-        <w:t>Ensure code quality, scalability, and security compliance.</w:t>
-      </w:r>
-    </w:p>
-    <w:p>
-      <w:pPr>
-        <w:pStyle w:val="Heading2"/>
-      </w:pPr>
-      <w:r>
-        <w:t>Software Engineering / Packaged App Development Associate</w:t>
-      </w:r>
-    </w:p>
-    <w:p>
-      <w:r>
-        <w:t>Accenture Inc. – Ebloc 2, Cebu IT Park, Cebu City, Philippines</w:t>
-      </w:r>
-    </w:p>
-    <w:p>
-      <w:r>
-        <w:t>February 27, 2023 – March 18, 2026</w:t>
+        <w:t>Performed system enhancements, debugging, and production support.</w:t>
       </w:r>
     </w:p>
     <w:p>
@@ -220,81 +227,50 @@
         <w:pStyle w:val="ListBullet"/>
       </w:pPr>
       <w:r>
-        <w:t>Developed and supported enterprise-level software applications.</w:t>
+        <w:t>Collaborated with global teams in an Agile delivery model.</w:t>
       </w:r>
     </w:p>
     <w:p>
       <w:pPr>
-        <w:pStyle w:val="ListBullet"/>
-      </w:pPr>
-      <w:r>
-        <w:t>Worked on packaged application development and system enhancements.</w:t>
-      </w:r>
-    </w:p>
-    <w:p>
-      <w:pPr>
-        <w:pStyle w:val="ListBullet"/>
-      </w:pPr>
-      <w:r>
-        <w:t>Participated in software testing, debugging, and production support.</w:t>
-      </w:r>
-    </w:p>
-    <w:p>
-      <w:pPr>
-        <w:pStyle w:val="ListBullet"/>
-      </w:pPr>
-      <w:r>
-        <w:t>Collaborated with global teams in Agile delivery environment.</w:t>
-      </w:r>
-    </w:p>
-    <w:p>
-      <w:pPr>
-        <w:pStyle w:val="ListBullet"/>
-      </w:pPr>
-      <w:r>
-        <w:t>Delivered system fixes and enhancements within SLA timelines.</w:t>
-      </w:r>
-    </w:p>
-    <w:p>
-      <w:pPr>
-        <w:pStyle w:val="ListBullet"/>
-      </w:pPr>
-      <w:r>
-        <w:t>Supported API integrations and backend services using Java, .NET, and Node.js.</w:t>
-      </w:r>
-    </w:p>
-    <w:p>
-      <w:pPr>
-        <w:pStyle w:val="Heading1"/>
+        <w:pStyle w:val="Heading2"/>
+        <w:spacing w:before="120" w:after="120"/>
       </w:pPr>
       <w:r>
         <w:t>EDUCATION</w:t>
       </w:r>
     </w:p>
     <w:p>
-      <w:pPr>
-        <w:pStyle w:val="Heading2"/>
-      </w:pPr>
       <w:r>
+        <w:rPr>
+          <w:b/>
+        </w:rPr>
         <w:t>Bachelor of Science in Computer Engineering</w:t>
       </w:r>
     </w:p>
     <w:p>
       <w:r>
-        <w:t>University of Cebu – Main Campus, Sanciangko St., Cebu City</w:t>
+        <w:t>University of Cebu – Main Campus, Sanciangko St., Cebu City | 2017 – 2018</w:t>
       </w:r>
     </w:p>
     <w:p>
       <w:r>
-        <w:t>2017 – 2018</w:t>
+        <w:rPr>
+          <w:b/>
+        </w:rPr>
+        <w:t>Arcelo Memorial National High School</w:t>
       </w:r>
     </w:p>
     <w:p>
-      <w:pPr>
-        <w:pStyle w:val="Heading2"/>
-      </w:pPr>
       <w:r>
-        <w:t>Arcelo Memorial National High School</w:t>
+        <w:t>San Vicente, Liloan, Cebu</w:t>
+      </w:r>
+    </w:p>
+    <w:p>
+      <w:r>
+        <w:rPr>
+          <w:b/>
+        </w:rPr>
+        <w:t>Simeon Ayuda Elementary School</w:t>
       </w:r>
     </w:p>
     <w:p>
@@ -305,30 +281,23 @@
     <w:p>
       <w:pPr>
         <w:pStyle w:val="Heading2"/>
+        <w:spacing w:before="120" w:after="120"/>
       </w:pPr>
       <w:r>
-        <w:t>Simeon Ayuda Elementary School</w:t>
+        <w:t>PROJECTS &amp; ACHIEVEMENTS</w:t>
       </w:r>
     </w:p>
     <w:p>
       <w:r>
-        <w:t>San Vicente, Liloan, Cebu</w:t>
+        <w:rPr>
+          <w:b/>
+        </w:rPr>
+        <w:t>GEN AI Mini-Hackathon Winner</w:t>
       </w:r>
     </w:p>
     <w:p>
-      <w:pPr>
-        <w:pStyle w:val="Heading1"/>
-      </w:pPr>
       <w:r>
-        <w:t>PROJECT / ACHIEVEMENTS</w:t>
-      </w:r>
-    </w:p>
-    <w:p>
-      <w:pPr>
-        <w:pStyle w:val="Heading2"/>
-      </w:pPr>
-      <w:r>
-        <w:t>GEN AI Mini-Hackathon Winner (Team Project – 5 Members, 2025)</w:t>
+        <w:t>Team project, 2025</w:t>
       </w:r>
     </w:p>
     <w:p>
@@ -336,7 +305,7 @@
         <w:pStyle w:val="ListBullet"/>
       </w:pPr>
       <w:r>
-        <w:t>Built a conversational AI agent to guide application teams in creating structured change requests.</w:t>
+        <w:t>Built a conversational AI agent for structured change request intake.</w:t>
       </w:r>
     </w:p>
     <w:p>
@@ -344,7 +313,7 @@
         <w:pStyle w:val="ListBullet"/>
       </w:pPr>
       <w:r>
-        <w:t>System collects environment, resources, schedule, and requirement details.</w:t>
+        <w:t>Collected resources, schedule, environment, and requirement details.</w:t>
       </w:r>
     </w:p>
     <w:p>
@@ -352,76 +321,12 @@
         <w:pStyle w:val="ListBullet"/>
       </w:pPr>
       <w:r>
-        <w:t>Generates structured summary for submission and approval.</w:t>
-      </w:r>
-    </w:p>
-    <w:p>
-      <w:pPr>
-        <w:pStyle w:val="ListBullet"/>
-      </w:pPr>
-      <w:r>
-        <w:t>Strengthened skills in AI integration, automation, and system design.</w:t>
-      </w:r>
-    </w:p>
-    <w:p>
-      <w:pPr>
-        <w:pStyle w:val="ListBullet"/>
-      </w:pPr>
-      <w:r>
-        <w:t>Tools: AI workflows, API integration, collaborative development.</w:t>
-      </w:r>
-    </w:p>
-    <w:p>
-      <w:pPr>
-        <w:pStyle w:val="Heading1"/>
-      </w:pPr>
-      <w:r>
-        <w:t>KEY STRENGTHS</w:t>
-      </w:r>
-    </w:p>
-    <w:p>
-      <w:pPr>
-        <w:pStyle w:val="ListBullet"/>
-      </w:pPr>
-      <w:r>
-        <w:t>Strong analytical and problem-solving skills</w:t>
-      </w:r>
-    </w:p>
-    <w:p>
-      <w:pPr>
-        <w:pStyle w:val="ListBullet"/>
-      </w:pPr>
-      <w:r>
-        <w:t>Ability to work independently and in team environments</w:t>
-      </w:r>
-    </w:p>
-    <w:p>
-      <w:pPr>
-        <w:pStyle w:val="ListBullet"/>
-      </w:pPr>
-      <w:r>
-        <w:t>Fast learner of new technologies</w:t>
-      </w:r>
-    </w:p>
-    <w:p>
-      <w:pPr>
-        <w:pStyle w:val="ListBullet"/>
-      </w:pPr>
-      <w:r>
-        <w:t>Strong communication and collaboration skills</w:t>
-      </w:r>
-    </w:p>
-    <w:p>
-      <w:pPr>
-        <w:pStyle w:val="ListBullet"/>
-      </w:pPr>
-      <w:r>
-        <w:t>Adaptable in fast-paced project environments</w:t>
+        <w:t>Generated submission-ready structured summaries.</w:t>
       </w:r>
     </w:p>
     <w:sectPr>
       <w:pgSz w:w="12240" w:h="15840"/>
-      <w:pgMar w:top="1440" w:right="1800" w:bottom="1440" w:left="1800" w:header="720" w:footer="720" w:gutter="0"/>
+      <w:pgMar w:top="720" w:right="720" w:bottom="720" w:left="720" w:header="720" w:footer="720" w:gutter="0"/>
       <w:cols w:space="720"/>
       <w:docGrid w:linePitch="360"/>
     </w:sectPr>

</xml_diff>

<commit_message>
Update Experience section with detailed achievements and Accenture location (Ebloc 2)
</commit_message>
<xml_diff>
--- a/Rolyn_Kiunisala_CV.docx
+++ b/Rolyn_Kiunisala_CV.docx
@@ -147,7 +147,7 @@
         <w:spacing w:after="60"/>
       </w:pPr>
       <w:r>
-        <w:t>ALMA Phil Manpower Services Corp. – Cebu City, Philippines | March 18, 2026 – Present</w:t>
+        <w:t>ALMA Phil Manpower Services Corp. – Cebu City, Philippines | March 18, 2026 – Present (Project-Based Contract)</w:t>
       </w:r>
     </w:p>
     <w:p>
@@ -155,7 +155,7 @@
         <w:pStyle w:val="ListBullet"/>
       </w:pPr>
       <w:r>
-        <w:t>Designed, developed, and maintained full stack web applications.</w:t>
+        <w:t>Design, develop, and maintain full stack web applications based on client requirements.</w:t>
       </w:r>
     </w:p>
     <w:p>
@@ -163,7 +163,7 @@
         <w:pStyle w:val="ListBullet"/>
       </w:pPr>
       <w:r>
-        <w:t>Built REST APIs and backend services with Node.js, Java, and .NET.</w:t>
+        <w:t>Develop and integrate REST APIs and backend services using Node.js, Java, and .NET.</w:t>
       </w:r>
     </w:p>
     <w:p>
@@ -171,7 +171,7 @@
         <w:pStyle w:val="ListBullet"/>
       </w:pPr>
       <w:r>
-        <w:t>Developed responsive frontend interfaces using Angular.</w:t>
+        <w:t>Build responsive frontend interfaces using Angular and modern web technologies.</w:t>
       </w:r>
     </w:p>
     <w:p>
@@ -179,7 +179,7 @@
         <w:pStyle w:val="ListBullet"/>
       </w:pPr>
       <w:r>
-        <w:t>Handled debugging, troubleshooting, and performance tuning.</w:t>
+        <w:t>Perform debugging, troubleshooting, and performance optimization.</w:t>
       </w:r>
     </w:p>
     <w:p>
@@ -187,7 +187,23 @@
         <w:pStyle w:val="ListBullet"/>
       </w:pPr>
       <w:r>
-        <w:t>Collaborated in Agile teams for testing, deployment, and release support.</w:t>
+        <w:t>Collaborate with project managers and technical teams in Agile environment.</w:t>
+      </w:r>
+    </w:p>
+    <w:p>
+      <w:pPr>
+        <w:pStyle w:val="ListBullet"/>
+      </w:pPr>
+      <w:r>
+        <w:t>Participate in system enhancements, testing, and deployment activities.</w:t>
+      </w:r>
+    </w:p>
+    <w:p>
+      <w:pPr>
+        <w:pStyle w:val="ListBullet"/>
+      </w:pPr>
+      <w:r>
+        <w:t>Ensure code quality, scalability, and security compliance.</w:t>
       </w:r>
     </w:p>
     <w:p>
@@ -203,7 +219,7 @@
         <w:spacing w:after="60"/>
       </w:pPr>
       <w:r>
-        <w:t>Accenture Inc. – Cebu IT Park, Cebu City | February 27, 2023 – March 18, 2026</w:t>
+        <w:t>Accenture Inc. – Ebloc 2, Cebu IT Park, Cebu City, Philippines | February 27, 2023 – March 18, 2026</w:t>
       </w:r>
     </w:p>
     <w:p>
@@ -211,7 +227,7 @@
         <w:pStyle w:val="ListBullet"/>
       </w:pPr>
       <w:r>
-        <w:t>Supported enterprise-level packaged application development.</w:t>
+        <w:t>Developed and supported enterprise-level software applications.</w:t>
       </w:r>
     </w:p>
     <w:p>
@@ -219,7 +235,7 @@
         <w:pStyle w:val="ListBullet"/>
       </w:pPr>
       <w:r>
-        <w:t>Performed system enhancements, debugging, and production support.</w:t>
+        <w:t>Worked on packaged application development and system enhancements.</w:t>
       </w:r>
     </w:p>
     <w:p>
@@ -227,7 +243,31 @@
         <w:pStyle w:val="ListBullet"/>
       </w:pPr>
       <w:r>
-        <w:t>Collaborated with global teams in an Agile delivery model.</w:t>
+        <w:t>Participated in software testing, debugging, and production support.</w:t>
+      </w:r>
+    </w:p>
+    <w:p>
+      <w:pPr>
+        <w:pStyle w:val="ListBullet"/>
+      </w:pPr>
+      <w:r>
+        <w:t>Collaborated with global teams in Agile delivery environment.</w:t>
+      </w:r>
+    </w:p>
+    <w:p>
+      <w:pPr>
+        <w:pStyle w:val="ListBullet"/>
+      </w:pPr>
+      <w:r>
+        <w:t>Delivered system fixes and enhancements within SLA timelines.</w:t>
+      </w:r>
+    </w:p>
+    <w:p>
+      <w:pPr>
+        <w:pStyle w:val="ListBullet"/>
+      </w:pPr>
+      <w:r>
+        <w:t>Supported API integrations and backend services using Java, .NET, and Node.js.</w:t>
       </w:r>
     </w:p>
     <w:p>

</xml_diff>